<commit_message>
feat(privacy): periodi di conservazione accordo/nomina e materiali certificati/PEC nell'informativa
- accordo firmato e modulo di nomina: 10 anni dalla cessazione, estendibile
  finché il contenuto pubblicato che autorizzano resta online (artt. 5.2 e
  7.1 GDPR)
- materiali certificati del pacchetto sigillato e archivio PEC: 10 anni dal
  sigillo, estendibili di 5 per tutela legale (art. 17.3.e GDPR; artt. 2946
  e 2947 c.c.); revisione periodica (art. 5.1.e GDPR, Considerando 39)
- PRIVACY_VERSION aggiornata a 2026-08-21f (nuovo riconsenso)
- Documento 2 (informativa/liberatoria terzi): stesso schema 10+5, punto 8
</commit_message>
<xml_diff>
--- a/public/documenti/2-informativa-liberatoria-esterni.docx
+++ b/public/documenti/2-informativa-liberatoria-esterni.docx
@@ -592,7 +592,35 @@
           <w:sz w:val="20"/>
           <w:szCs w:val="20"/>
         </w:rPr>
-        <w:t xml:space="preserve">Revisione periodica: il Coordinatore effettuerà una revisione almeno ogni 5 (cinque) anni per valutare se i contenuti mantengano un interesse editoriale/documentale. Solo in caso di esplicita motivazione scritta di rilevanza storica, culturale o scientifica, il termine potrà essere prorogato di ulteriori periodi. La motivazione scritta sarà redatta dal Coordinatore e conservata nel gestionale, costituendo atto interno del Progetto. In assenza di tale revisione motivata, i dati verranno cancellati da tutti i supporti allo scadere del quinto anno.</w:t>
+        <w:t>Revisione periodica: il Coordinatore effettuerà una revisione almeno ogni 5 (cinque) anni per valutare se i contenuti mantengano un interesse editoriale/documentale. Solo in caso di esplicita motivazione scritta di rilevanza storica, culturale o scientifica, il termine potrà essere prorogato di ulteriori periodi. La motivazione scritta sarà redatta dal Coordinatore e conservata nel gestionale, costituendo atto interno del Progetto. In assenza di tale revisione motivata, i dati verranno cancellati da tutti i supporti allo scadere del quinto anno. La previsione di una revisione periodica anziché di un termine fisso e definitivo è la modalità di conservazione indicata dall'art. 5, par. 1, lett. e), del GDPR e dal Considerando 39 dello stesso Regolamento.</w:t>
+      </w:r>
+    </w:p>
+    <w:p>
+      <w:pPr>
+        <w:spacing w:after="90"/>
+      </w:pPr>
+      <w:r>
+        <w:rPr>
+          <w:b/>
+          <w:color w:val="222222"/>
+          <w:sz w:val="20"/>
+          <w:szCs w:val="20"/>
+        </w:rPr>
+        <w:t>Conservazione della liberatoria sottoscritta: la liberatoria di cui alla Sezione 2, quale prova del consenso prestato, è conservata separatamente per un periodo di 10 (dieci) anni dalla data del sigillo del contenuto a cui si riferisce, estendibile finché il contenuto pubblicato rimane online, con le stesse modalità di revisione di cui sopra. Il Titolare resta infatti tenuto a poter dimostrare in ogni momento la validità del consenso, ai sensi degli artt. 5, par. 2, e 7, par. 1, del GDPR, per tutto il tempo in cui il contenuto correlato resta pubblicato.</w:t>
+      </w:r>
+    </w:p>
+    <w:p>
+      <w:pPr>
+        <w:spacing w:after="90"/>
+      </w:pPr>
+      <w:r>
+        <w:rPr>
+          <w:b w:val="0"/>
+          <w:color w:val="222222"/>
+          <w:sz w:val="20"/>
+          <w:szCs w:val="20"/>
+        </w:rPr>
+        <w:t>I materiali certificati del pacchetto sigillato e l'archivio delle comunicazioni PEC relative alla presente liberatoria sono conservati per un periodo di 10 (dieci) anni dalla data del sigillo, estendibile di ulteriori 5 (cinque) anni per esigenze di tutela legale, ai sensi dell'art. 17, par. 3, lett. e), del GDPR e degli artt. 2946 e 2947 del Codice Civile.</w:t>
       </w:r>
     </w:p>
     <w:p>

</xml_diff>